<commit_message>
Adds editablity of SenderEmail & SenderName to Affiliate record Add ReplyToHandler so replies to Mandrill emails are handled. Created OrderSubmitted template for OnDemand orders Fixed CC bug Minor template fixes
</commit_message>
<xml_diff>
--- a/CUWebinars.Web/App_Data/mergeTemplates/OrderSubmitted_PostEvent.docx
+++ b/CUWebinars.Web/App_Data/mergeTemplates/OrderSubmitted_PostEvent.docx
@@ -1,6 +1,6 @@
 
 <file path=word/document.xml><?xml version="1.0" encoding="utf-8"?>
-<w:document xmlns:wpc="http://schemas.microsoft.com/office/word/2010/wordprocessingCanvas" xmlns:cx="http://schemas.microsoft.com/office/drawing/2014/chartex" xmlns:cx1="http://schemas.microsoft.com/office/drawing/2015/9/8/chartex" xmlns:cx2="http://schemas.microsoft.com/office/drawing/2015/10/21/chartex" xmlns:cx3="http://schemas.microsoft.com/office/drawing/2016/5/9/chartex" xmlns:cx4="http://schemas.microsoft.com/office/drawing/2016/5/10/chartex" xmlns:cx5="http://schemas.microsoft.com/office/drawing/2016/5/11/chartex" xmlns:mc="http://schemas.openxmlformats.org/markup-compatibility/2006" xmlns:o="urn:schemas-microsoft-com:office:office" xmlns:r="http://schemas.openxmlformats.org/officeDocument/2006/relationships" xmlns:m="http://schemas.openxmlformats.org/officeDocument/2006/math" xmlns:v="urn:schemas-microsoft-com:vml" xmlns:wp14="http://schemas.microsoft.com/office/word/2010/wordprocessingDrawing" xmlns:wp="http://schemas.openxmlformats.org/drawingml/2006/wordprocessingDrawing" xmlns:w10="urn:schemas-microsoft-com:office:word" xmlns:w="http://schemas.openxmlformats.org/wordprocessingml/2006/main" xmlns:w14="http://schemas.microsoft.com/office/word/2010/wordml" xmlns:w15="http://schemas.microsoft.com/office/word/2012/wordml" xmlns:w16se="http://schemas.microsoft.com/office/word/2015/wordml/symex" xmlns:wpg="http://schemas.microsoft.com/office/word/2010/wordprocessingGroup" xmlns:wpi="http://schemas.microsoft.com/office/word/2010/wordprocessingInk" xmlns:wne="http://schemas.microsoft.com/office/word/2006/wordml" xmlns:wps="http://schemas.microsoft.com/office/word/2010/wordprocessingShape" mc:Ignorable="w14 w15 w16se wp14">
+<w:document xmlns:wpc="http://schemas.microsoft.com/office/word/2010/wordprocessingCanvas" xmlns:cx="http://schemas.microsoft.com/office/drawing/2014/chartex" xmlns:cx1="http://schemas.microsoft.com/office/drawing/2015/9/8/chartex" xmlns:cx2="http://schemas.microsoft.com/office/drawing/2015/10/21/chartex" xmlns:cx3="http://schemas.microsoft.com/office/drawing/2016/5/9/chartex" xmlns:cx4="http://schemas.microsoft.com/office/drawing/2016/5/10/chartex" xmlns:cx5="http://schemas.microsoft.com/office/drawing/2016/5/11/chartex" xmlns:cx6="http://schemas.microsoft.com/office/drawing/2016/5/12/chartex" xmlns:cx7="http://schemas.microsoft.com/office/drawing/2016/5/13/chartex" xmlns:cx8="http://schemas.microsoft.com/office/drawing/2016/5/14/chartex" xmlns:mc="http://schemas.openxmlformats.org/markup-compatibility/2006" xmlns:aink="http://schemas.microsoft.com/office/drawing/2016/ink" xmlns:o="urn:schemas-microsoft-com:office:office" xmlns:r="http://schemas.openxmlformats.org/officeDocument/2006/relationships" xmlns:m="http://schemas.openxmlformats.org/officeDocument/2006/math" xmlns:v="urn:schemas-microsoft-com:vml" xmlns:wp14="http://schemas.microsoft.com/office/word/2010/wordprocessingDrawing" xmlns:wp="http://schemas.openxmlformats.org/drawingml/2006/wordprocessingDrawing" xmlns:w10="urn:schemas-microsoft-com:office:word" xmlns:w="http://schemas.openxmlformats.org/wordprocessingml/2006/main" xmlns:w14="http://schemas.microsoft.com/office/word/2010/wordml" xmlns:w15="http://schemas.microsoft.com/office/word/2012/wordml" xmlns:w16se="http://schemas.microsoft.com/office/word/2015/wordml/symex" xmlns:wpg="http://schemas.microsoft.com/office/word/2010/wordprocessingGroup" xmlns:wpi="http://schemas.microsoft.com/office/word/2010/wordprocessingInk" xmlns:wne="http://schemas.microsoft.com/office/word/2006/wordml" xmlns:wps="http://schemas.microsoft.com/office/word/2010/wordprocessingShape" mc:Ignorable="w14 w15 w16se wp14">
   <w:body>
     <w:tbl>
       <w:tblPr>
@@ -17,10 +17,10 @@
         <w:tblLook w:val="04A0" w:firstRow="1" w:lastRow="0" w:firstColumn="1" w:lastColumn="0" w:noHBand="0" w:noVBand="1"/>
       </w:tblPr>
       <w:tblGrid>
-        <w:gridCol w:w="260"/>
-        <w:gridCol w:w="6006"/>
+        <w:gridCol w:w="265"/>
+        <w:gridCol w:w="6305"/>
         <w:gridCol w:w="2835"/>
-        <w:gridCol w:w="259"/>
+        <w:gridCol w:w="265"/>
       </w:tblGrid>
       <w:tr>
         <w:tc>
@@ -470,14 +470,27 @@
             <w:r>
               <w:t xml:space="preserve">Dear </w:t>
             </w:r>
-            <w:fldSimple w:instr=" MERGEFIELD  FirstName  \* MERGEFORMAT ">
-              <w:r>
-                <w:rPr>
-                  <w:noProof/>
-                </w:rPr>
-                <w:t>«FirstName»</w:t>
-              </w:r>
-            </w:fldSimple>
+            <w:r>
+              <w:fldChar w:fldCharType="begin"/>
+            </w:r>
+            <w:r>
+              <w:instrText xml:space="preserve"> MERGEFIELD  FirstName  \* MERGEFORMAT </w:instrText>
+            </w:r>
+            <w:r>
+              <w:fldChar w:fldCharType="separate"/>
+            </w:r>
+            <w:r>
+              <w:rPr>
+                <w:noProof/>
+              </w:rPr>
+              <w:t>«FirstName»</w:t>
+            </w:r>
+            <w:r>
+              <w:rPr>
+                <w:noProof/>
+              </w:rPr>
+              <w:fldChar w:fldCharType="end"/>
+            </w:r>
             <w:r>
               <w:t>,</w:t>
             </w:r>
@@ -545,24 +558,196 @@
             <w:r>
               <w:t xml:space="preserve"> </w:t>
             </w:r>
-            <w:fldSimple w:instr=" MERGEFIELD  RegDesc  \* MERGEFORMAT ">
-              <w:r>
-                <w:rPr>
-                  <w:noProof/>
-                </w:rPr>
-                <w:t>«RegDesc»</w:t>
-              </w:r>
-            </w:fldSimple>
+            <w:r>
+              <w:fldChar w:fldCharType="begin"/>
+            </w:r>
+            <w:r>
+              <w:instrText xml:space="preserve"> MERGEFIELD  RegDesc  \* MERGEFORMAT </w:instrText>
+            </w:r>
+            <w:r>
+              <w:fldChar w:fldCharType="separate"/>
+            </w:r>
+            <w:r>
+              <w:rPr>
+                <w:noProof/>
+              </w:rPr>
+              <w:t>«RegDesc»</w:t>
+            </w:r>
+            <w:r>
+              <w:rPr>
+                <w:noProof/>
+              </w:rPr>
+              <w:fldChar w:fldCharType="end"/>
+            </w:r>
             <w:r>
               <w:t xml:space="preserve"> </w:t>
+            </w:r>
+          </w:p>
+          <w:p>
+            <w:pPr>
+              <w:spacing w:before="200"/>
+              <w:rPr>
+                <w:noProof/>
+              </w:rPr>
+            </w:pPr>
+            <w:r>
+              <w:t xml:space="preserve">How </w:t>
+            </w:r>
+            <w:proofErr w:type="gramStart"/>
+            <w:r>
+              <w:t>To</w:t>
+            </w:r>
+            <w:proofErr w:type="gramEnd"/>
+            <w:r>
+              <w:t xml:space="preserve"> Access Your Recording:</w:t>
+            </w:r>
+            <w:r>
+              <w:br/>
+            </w:r>
+            <w:r>
+              <w:rPr>
+                <w:b/>
+                <w:i/>
+              </w:rPr>
+              <w:t>If you are the original registrant</w:t>
+            </w:r>
+            <w:r>
+              <w:t xml:space="preserve"> ( </w:t>
+            </w:r>
+            <w:r>
+              <w:fldChar w:fldCharType="begin"/>
+            </w:r>
+            <w:r>
+              <w:instrText xml:space="preserve"> MERGEFIELD  BillingEmail  \* MERGEFORMAT </w:instrText>
+            </w:r>
+            <w:r>
+              <w:fldChar w:fldCharType="separate"/>
+            </w:r>
+            <w:r>
+              <w:rPr>
+                <w:noProof/>
+              </w:rPr>
+              <w:t>«BillingEmail»</w:t>
+            </w:r>
+            <w:r>
+              <w:rPr>
+                <w:noProof/>
+              </w:rPr>
+              <w:fldChar w:fldCharType="end"/>
+            </w:r>
+            <w:r>
+              <w:rPr>
+                <w:noProof/>
+              </w:rPr>
+              <w:t xml:space="preserve"> ) </w:t>
+            </w:r>
+            <w:bookmarkStart w:id="0" w:name="_GoBack"/>
+            <w:bookmarkEnd w:id="0"/>
+            <w:r>
+              <w:t xml:space="preserve">you can log into your account to access the full details of your order. </w:t>
+            </w:r>
+            <w:r>
+              <w:fldChar w:fldCharType="begin"/>
+            </w:r>
+            <w:r>
+              <w:instrText xml:space="preserve"> MERGEFIELD  LinkToMyWebinars  \* MERGEFORMAT </w:instrText>
+            </w:r>
+            <w:r>
+              <w:fldChar w:fldCharType="separate"/>
+            </w:r>
+            <w:r>
+              <w:rPr>
+                <w:noProof/>
+              </w:rPr>
+              <w:t>«LinkToMyWebinars»</w:t>
+            </w:r>
+            <w:r>
+              <w:rPr>
+                <w:noProof/>
+              </w:rPr>
+              <w:fldChar w:fldCharType="end"/>
             </w:r>
           </w:p>
           <w:p>
             <w:pPr>
               <w:spacing w:before="200"/>
             </w:pPr>
-            <w:bookmarkStart w:id="0" w:name="_GoBack"/>
-            <w:bookmarkEnd w:id="0"/>
+            <w:r>
+              <w:rPr>
+                <w:b/>
+                <w:i/>
+              </w:rPr>
+              <w:t>If you</w:t>
+            </w:r>
+            <w:r>
+              <w:rPr>
+                <w:b/>
+                <w:i/>
+              </w:rPr>
+              <w:t xml:space="preserve"> are not the original registrant</w:t>
+            </w:r>
+            <w:r>
+              <w:t xml:space="preserve"> - you can access the content by visiting the link below. No password required but you will be prompted for name and email. </w:t>
+            </w:r>
+            <w:r>
+              <w:fldChar w:fldCharType="begin"/>
+            </w:r>
+            <w:r>
+              <w:instrText xml:space="preserve"> MERGEFIELD  OndemandLink  \* MERGEFORMAT </w:instrText>
+            </w:r>
+            <w:r>
+              <w:fldChar w:fldCharType="separate"/>
+            </w:r>
+            <w:r>
+              <w:rPr>
+                <w:noProof/>
+              </w:rPr>
+              <w:t>«OndemandLink»</w:t>
+            </w:r>
+            <w:r>
+              <w:rPr>
+                <w:noProof/>
+              </w:rPr>
+              <w:fldChar w:fldCharType="end"/>
+            </w:r>
+            <w:r>
+              <w:t>.</w:t>
+            </w:r>
+          </w:p>
+          <w:p>
+            <w:pPr>
+              <w:spacing w:before="200"/>
+              <w:rPr>
+                <w:noProof/>
+              </w:rPr>
+            </w:pPr>
+            <w:r>
+              <w:fldChar w:fldCharType="begin"/>
+            </w:r>
+            <w:r>
+              <w:instrText xml:space="preserve"> MERGEFIELD  PaymentCaption  \* MERGEFORMAT </w:instrText>
+            </w:r>
+            <w:r>
+              <w:fldChar w:fldCharType="separate"/>
+            </w:r>
+            <w:r>
+              <w:rPr>
+                <w:noProof/>
+              </w:rPr>
+              <w:t>«PaymentCaption»</w:t>
+            </w:r>
+            <w:r>
+              <w:rPr>
+                <w:noProof/>
+              </w:rPr>
+              <w:fldChar w:fldCharType="end"/>
+            </w:r>
+          </w:p>
+          <w:p/>
+          <w:p>
+            <w:pPr>
+              <w:spacing w:before="200"/>
+            </w:pPr>
           </w:p>
         </w:tc>
         <w:tc>
@@ -1652,7 +1837,7 @@
 </file>
 
 <file path=customXml/itemProps1.xml><?xml version="1.0" encoding="utf-8"?>
-<ds:datastoreItem xmlns:ds="http://schemas.openxmlformats.org/officeDocument/2006/customXml" ds:itemID="{8F7CB6A4-F367-48CF-B5B8-7F7186B04734}">
+<ds:datastoreItem xmlns:ds="http://schemas.openxmlformats.org/officeDocument/2006/customXml" ds:itemID="{F43E2A0E-2A82-42ED-BC0F-409B9BC1C6F5}">
   <ds:schemaRefs>
     <ds:schemaRef ds:uri="http://schemas.openxmlformats.org/officeDocument/2006/bibliography"/>
   </ds:schemaRefs>

</xml_diff>

<commit_message>
Removes legacy RecordingIsPosted method Corrects problem with EditUser where end-user was not logged in. Routes all order confirmations (except DES) thru _SendOrderConfirmation2 Tests model.CheckoutConfirmViewModel  for null
Removes guard against testing Mandrill notis.

Updates LivePlusFive display in EditWebinar screen.

Corrects TimeZone in notificiations.
</commit_message>
<xml_diff>
--- a/CUWebinars.Web/App_Data/mergeTemplates/OrderSubmitted_PostEvent.docx
+++ b/CUWebinars.Web/App_Data/mergeTemplates/OrderSubmitted_PostEvent.docx
@@ -1,6 +1,6 @@
 
 <file path=word/document.xml><?xml version="1.0" encoding="utf-8"?>
-<w:document xmlns:wpc="http://schemas.microsoft.com/office/word/2010/wordprocessingCanvas" xmlns:cx="http://schemas.microsoft.com/office/drawing/2014/chartex" xmlns:cx1="http://schemas.microsoft.com/office/drawing/2015/9/8/chartex" xmlns:cx2="http://schemas.microsoft.com/office/drawing/2015/10/21/chartex" xmlns:cx3="http://schemas.microsoft.com/office/drawing/2016/5/9/chartex" xmlns:cx4="http://schemas.microsoft.com/office/drawing/2016/5/10/chartex" xmlns:cx5="http://schemas.microsoft.com/office/drawing/2016/5/11/chartex" xmlns:cx6="http://schemas.microsoft.com/office/drawing/2016/5/12/chartex" xmlns:cx7="http://schemas.microsoft.com/office/drawing/2016/5/13/chartex" xmlns:cx8="http://schemas.microsoft.com/office/drawing/2016/5/14/chartex" xmlns:mc="http://schemas.openxmlformats.org/markup-compatibility/2006" xmlns:aink="http://schemas.microsoft.com/office/drawing/2016/ink" xmlns:o="urn:schemas-microsoft-com:office:office" xmlns:r="http://schemas.openxmlformats.org/officeDocument/2006/relationships" xmlns:m="http://schemas.openxmlformats.org/officeDocument/2006/math" xmlns:v="urn:schemas-microsoft-com:vml" xmlns:wp14="http://schemas.microsoft.com/office/word/2010/wordprocessingDrawing" xmlns:wp="http://schemas.openxmlformats.org/drawingml/2006/wordprocessingDrawing" xmlns:w10="urn:schemas-microsoft-com:office:word" xmlns:w="http://schemas.openxmlformats.org/wordprocessingml/2006/main" xmlns:w14="http://schemas.microsoft.com/office/word/2010/wordml" xmlns:w15="http://schemas.microsoft.com/office/word/2012/wordml" xmlns:w16se="http://schemas.microsoft.com/office/word/2015/wordml/symex" xmlns:wpg="http://schemas.microsoft.com/office/word/2010/wordprocessingGroup" xmlns:wpi="http://schemas.microsoft.com/office/word/2010/wordprocessingInk" xmlns:wne="http://schemas.microsoft.com/office/word/2006/wordml" xmlns:wps="http://schemas.microsoft.com/office/word/2010/wordprocessingShape" mc:Ignorable="w14 w15 w16se wp14">
+<w:document xmlns:wpc="http://schemas.microsoft.com/office/word/2010/wordprocessingCanvas" xmlns:cx="http://schemas.microsoft.com/office/drawing/2014/chartex" xmlns:cx1="http://schemas.microsoft.com/office/drawing/2015/9/8/chartex" xmlns:cx2="http://schemas.microsoft.com/office/drawing/2015/10/21/chartex" xmlns:cx3="http://schemas.microsoft.com/office/drawing/2016/5/9/chartex" xmlns:cx4="http://schemas.microsoft.com/office/drawing/2016/5/10/chartex" xmlns:cx5="http://schemas.microsoft.com/office/drawing/2016/5/11/chartex" xmlns:cx6="http://schemas.microsoft.com/office/drawing/2016/5/12/chartex" xmlns:cx7="http://schemas.microsoft.com/office/drawing/2016/5/13/chartex" xmlns:cx8="http://schemas.microsoft.com/office/drawing/2016/5/14/chartex" xmlns:mc="http://schemas.openxmlformats.org/markup-compatibility/2006" xmlns:aink="http://schemas.microsoft.com/office/drawing/2016/ink" xmlns:am3d="http://schemas.microsoft.com/office/drawing/2017/model3d" xmlns:o="urn:schemas-microsoft-com:office:office" xmlns:r="http://schemas.openxmlformats.org/officeDocument/2006/relationships" xmlns:m="http://schemas.openxmlformats.org/officeDocument/2006/math" xmlns:v="urn:schemas-microsoft-com:vml" xmlns:wp14="http://schemas.microsoft.com/office/word/2010/wordprocessingDrawing" xmlns:wp="http://schemas.openxmlformats.org/drawingml/2006/wordprocessingDrawing" xmlns:w10="urn:schemas-microsoft-com:office:word" xmlns:w="http://schemas.openxmlformats.org/wordprocessingml/2006/main" xmlns:w14="http://schemas.microsoft.com/office/word/2010/wordml" xmlns:w15="http://schemas.microsoft.com/office/word/2012/wordml" xmlns:w16cid="http://schemas.microsoft.com/office/word/2016/wordml/cid" xmlns:w16se="http://schemas.microsoft.com/office/word/2015/wordml/symex" xmlns:wpg="http://schemas.microsoft.com/office/word/2010/wordprocessingGroup" xmlns:wpi="http://schemas.microsoft.com/office/word/2010/wordprocessingInk" xmlns:wne="http://schemas.microsoft.com/office/word/2006/wordml" xmlns:wps="http://schemas.microsoft.com/office/word/2010/wordprocessingShape" mc:Ignorable="w14 w15 w16se w16cid wp14">
   <w:body>
     <w:tbl>
       <w:tblPr>
@@ -166,7 +166,7 @@
             <w:tr>
               <w:tc>
                 <w:tcPr>
-                  <w:tcW w:w="1373" w:type="dxa"/>
+                  <w:tcW w:w="1115" w:type="dxa"/>
                 </w:tcPr>
                 <w:p>
                   <w:pPr>
@@ -191,7 +191,7 @@
               </w:tc>
               <w:tc>
                 <w:tcPr>
-                  <w:tcW w:w="1557" w:type="dxa"/>
+                  <w:tcW w:w="1504" w:type="dxa"/>
                 </w:tcPr>
                 <w:p>
                   <w:pPr>
@@ -244,14 +244,13 @@
             <w:tr>
               <w:tc>
                 <w:tcPr>
-                  <w:tcW w:w="1373" w:type="dxa"/>
+                  <w:tcW w:w="1115" w:type="dxa"/>
                 </w:tcPr>
                 <w:p>
                   <w:pPr>
                     <w:pStyle w:val="NoSpacing"/>
                     <w:jc w:val="right"/>
                     <w:rPr>
-                      <w:noProof/>
                       <w:color w:val="7F7F7F" w:themeColor="text1" w:themeTint="80"/>
                       <w:sz w:val="18"/>
                       <w:szCs w:val="18"/>
@@ -263,51 +262,50 @@
                       <w:sz w:val="18"/>
                       <w:szCs w:val="18"/>
                     </w:rPr>
-                    <w:t>Attendance:</w:t>
+                    <w:t>Total:</w:t>
                   </w:r>
                 </w:p>
               </w:tc>
               <w:tc>
                 <w:tcPr>
-                  <w:tcW w:w="1557" w:type="dxa"/>
+                  <w:tcW w:w="1504" w:type="dxa"/>
                 </w:tcPr>
                 <w:p>
                   <w:pPr>
                     <w:pStyle w:val="NoSpacing"/>
                     <w:rPr>
+                      <w:sz w:val="18"/>
+                      <w:szCs w:val="18"/>
+                    </w:rPr>
+                  </w:pPr>
+                  <w:r>
+                    <w:rPr>
+                      <w:sz w:val="18"/>
+                      <w:szCs w:val="18"/>
+                    </w:rPr>
+                    <w:fldChar w:fldCharType="begin"/>
+                  </w:r>
+                  <w:r>
+                    <w:rPr>
+                      <w:sz w:val="18"/>
+                      <w:szCs w:val="18"/>
+                    </w:rPr>
+                    <w:instrText xml:space="preserve"> MERGEFIELD  Total  \* MERGEFORMAT </w:instrText>
+                  </w:r>
+                  <w:r>
+                    <w:rPr>
+                      <w:sz w:val="18"/>
+                      <w:szCs w:val="18"/>
+                    </w:rPr>
+                    <w:fldChar w:fldCharType="separate"/>
+                  </w:r>
+                  <w:r>
+                    <w:rPr>
                       <w:noProof/>
                       <w:sz w:val="18"/>
                       <w:szCs w:val="18"/>
                     </w:rPr>
-                  </w:pPr>
-                  <w:r>
-                    <w:rPr>
-                      <w:sz w:val="18"/>
-                      <w:szCs w:val="18"/>
-                    </w:rPr>
-                    <w:fldChar w:fldCharType="begin"/>
-                  </w:r>
-                  <w:r>
-                    <w:rPr>
-                      <w:sz w:val="18"/>
-                      <w:szCs w:val="18"/>
-                    </w:rPr>
-                    <w:instrText xml:space="preserve"> MERGEFIELD  AttendType  \* MERGEFORMAT </w:instrText>
-                  </w:r>
-                  <w:r>
-                    <w:rPr>
-                      <w:sz w:val="18"/>
-                      <w:szCs w:val="18"/>
-                    </w:rPr>
-                    <w:fldChar w:fldCharType="separate"/>
-                  </w:r>
-                  <w:r>
-                    <w:rPr>
-                      <w:noProof/>
-                      <w:sz w:val="18"/>
-                      <w:szCs w:val="18"/>
-                    </w:rPr>
-                    <w:t>«AttendType»</w:t>
+                    <w:t>«Total»</w:t>
                   </w:r>
                   <w:r>
                     <w:rPr>
@@ -322,7 +320,7 @@
             <w:tr>
               <w:tc>
                 <w:tcPr>
-                  <w:tcW w:w="1373" w:type="dxa"/>
+                  <w:tcW w:w="1115" w:type="dxa"/>
                 </w:tcPr>
                 <w:p>
                   <w:pPr>
@@ -335,19 +333,99 @@
                       <w:szCs w:val="18"/>
                     </w:rPr>
                   </w:pPr>
+                  <w:bookmarkStart w:id="0" w:name="_GoBack"/>
+                  <w:bookmarkEnd w:id="0"/>
                   <w:r>
                     <w:rPr>
                       <w:color w:val="7F7F7F" w:themeColor="text1" w:themeTint="80"/>
                       <w:sz w:val="18"/>
                       <w:szCs w:val="18"/>
                     </w:rPr>
-                    <w:t>Status:</w:t>
+                    <w:t>Attendance:</w:t>
                   </w:r>
                 </w:p>
               </w:tc>
               <w:tc>
                 <w:tcPr>
-                  <w:tcW w:w="1557" w:type="dxa"/>
+                  <w:tcW w:w="1504" w:type="dxa"/>
+                </w:tcPr>
+                <w:p>
+                  <w:pPr>
+                    <w:pStyle w:val="NoSpacing"/>
+                    <w:rPr>
+                      <w:noProof/>
+                      <w:sz w:val="18"/>
+                      <w:szCs w:val="18"/>
+                    </w:rPr>
+                  </w:pPr>
+                  <w:r>
+                    <w:rPr>
+                      <w:sz w:val="18"/>
+                      <w:szCs w:val="18"/>
+                    </w:rPr>
+                    <w:fldChar w:fldCharType="begin"/>
+                  </w:r>
+                  <w:r>
+                    <w:rPr>
+                      <w:sz w:val="18"/>
+                      <w:szCs w:val="18"/>
+                    </w:rPr>
+                    <w:instrText xml:space="preserve"> MERGEFIELD  AttendType  \* MERGEFORMAT </w:instrText>
+                  </w:r>
+                  <w:r>
+                    <w:rPr>
+                      <w:sz w:val="18"/>
+                      <w:szCs w:val="18"/>
+                    </w:rPr>
+                    <w:fldChar w:fldCharType="separate"/>
+                  </w:r>
+                  <w:r>
+                    <w:rPr>
+                      <w:noProof/>
+                      <w:sz w:val="18"/>
+                      <w:szCs w:val="18"/>
+                    </w:rPr>
+                    <w:t>«AttendType»</w:t>
+                  </w:r>
+                  <w:r>
+                    <w:rPr>
+                      <w:sz w:val="18"/>
+                      <w:szCs w:val="18"/>
+                    </w:rPr>
+                    <w:fldChar w:fldCharType="end"/>
+                  </w:r>
+                </w:p>
+              </w:tc>
+            </w:tr>
+            <w:tr>
+              <w:tc>
+                <w:tcPr>
+                  <w:tcW w:w="1115" w:type="dxa"/>
+                </w:tcPr>
+                <w:p>
+                  <w:pPr>
+                    <w:pStyle w:val="NoSpacing"/>
+                    <w:jc w:val="right"/>
+                    <w:rPr>
+                      <w:noProof/>
+                      <w:color w:val="7F7F7F" w:themeColor="text1" w:themeTint="80"/>
+                      <w:sz w:val="18"/>
+                      <w:szCs w:val="18"/>
+                    </w:rPr>
+                  </w:pPr>
+                  <w:r>
+                    <w:rPr>
+                      <w:color w:val="7F7F7F" w:themeColor="text1" w:themeTint="80"/>
+                      <w:sz w:val="18"/>
+                      <w:szCs w:val="18"/>
+                    </w:rPr>
+                    <w:t>Status:</w:t>
+                  </w:r>
+                </w:p>
+              </w:tc>
+              <w:tc>
+                <w:tcPr>
+                  <w:tcW w:w="1504" w:type="dxa"/>
                 </w:tcPr>
                 <w:p>
                   <w:pPr>
@@ -470,27 +548,14 @@
             <w:r>
               <w:t xml:space="preserve">Dear </w:t>
             </w:r>
-            <w:r>
-              <w:fldChar w:fldCharType="begin"/>
-            </w:r>
-            <w:r>
-              <w:instrText xml:space="preserve"> MERGEFIELD  FirstName  \* MERGEFORMAT </w:instrText>
-            </w:r>
-            <w:r>
-              <w:fldChar w:fldCharType="separate"/>
-            </w:r>
-            <w:r>
-              <w:rPr>
-                <w:noProof/>
-              </w:rPr>
-              <w:t>«FirstName»</w:t>
-            </w:r>
-            <w:r>
-              <w:rPr>
-                <w:noProof/>
-              </w:rPr>
-              <w:fldChar w:fldCharType="end"/>
-            </w:r>
+            <w:fldSimple w:instr=" MERGEFIELD  FirstName  \* MERGEFORMAT ">
+              <w:r>
+                <w:rPr>
+                  <w:noProof/>
+                </w:rPr>
+                <w:t>«FirstName»</w:t>
+              </w:r>
+            </w:fldSimple>
             <w:r>
               <w:t>,</w:t>
             </w:r>
@@ -558,27 +623,14 @@
             <w:r>
               <w:t xml:space="preserve"> </w:t>
             </w:r>
-            <w:r>
-              <w:fldChar w:fldCharType="begin"/>
-            </w:r>
-            <w:r>
-              <w:instrText xml:space="preserve"> MERGEFIELD  RegDesc  \* MERGEFORMAT </w:instrText>
-            </w:r>
-            <w:r>
-              <w:fldChar w:fldCharType="separate"/>
-            </w:r>
-            <w:r>
-              <w:rPr>
-                <w:noProof/>
-              </w:rPr>
-              <w:t>«RegDesc»</w:t>
-            </w:r>
-            <w:r>
-              <w:rPr>
-                <w:noProof/>
-              </w:rPr>
-              <w:fldChar w:fldCharType="end"/>
-            </w:r>
+            <w:fldSimple w:instr=" MERGEFIELD  RegDesc  \* MERGEFORMAT ">
+              <w:r>
+                <w:rPr>
+                  <w:noProof/>
+                </w:rPr>
+                <w:t>«RegDesc»</w:t>
+              </w:r>
+            </w:fldSimple>
             <w:r>
               <w:t xml:space="preserve"> </w:t>
             </w:r>
@@ -614,59 +666,31 @@
             <w:r>
               <w:t xml:space="preserve"> ( </w:t>
             </w:r>
-            <w:r>
-              <w:fldChar w:fldCharType="begin"/>
-            </w:r>
-            <w:r>
-              <w:instrText xml:space="preserve"> MERGEFIELD  BillingEmail  \* MERGEFORMAT </w:instrText>
-            </w:r>
-            <w:r>
-              <w:fldChar w:fldCharType="separate"/>
-            </w:r>
-            <w:r>
-              <w:rPr>
-                <w:noProof/>
-              </w:rPr>
-              <w:t>«BillingEmail»</w:t>
-            </w:r>
-            <w:r>
-              <w:rPr>
-                <w:noProof/>
-              </w:rPr>
-              <w:fldChar w:fldCharType="end"/>
-            </w:r>
+            <w:fldSimple w:instr=" MERGEFIELD  BillingEmail  \* MERGEFORMAT ">
+              <w:r>
+                <w:rPr>
+                  <w:noProof/>
+                </w:rPr>
+                <w:t>«BillingEmail»</w:t>
+              </w:r>
+            </w:fldSimple>
             <w:r>
               <w:rPr>
                 <w:noProof/>
               </w:rPr>
               <w:t xml:space="preserve"> ) </w:t>
             </w:r>
-            <w:bookmarkStart w:id="0" w:name="_GoBack"/>
-            <w:bookmarkEnd w:id="0"/>
             <w:r>
               <w:t xml:space="preserve">you can log into your account to access the full details of your order. </w:t>
             </w:r>
-            <w:r>
-              <w:fldChar w:fldCharType="begin"/>
-            </w:r>
-            <w:r>
-              <w:instrText xml:space="preserve"> MERGEFIELD  LinkToMyWebinars  \* MERGEFORMAT </w:instrText>
-            </w:r>
-            <w:r>
-              <w:fldChar w:fldCharType="separate"/>
-            </w:r>
-            <w:r>
-              <w:rPr>
-                <w:noProof/>
-              </w:rPr>
-              <w:t>«LinkToMyWebinars»</w:t>
-            </w:r>
-            <w:r>
-              <w:rPr>
-                <w:noProof/>
-              </w:rPr>
-              <w:fldChar w:fldCharType="end"/>
-            </w:r>
+            <w:fldSimple w:instr=" MERGEFIELD  LinkToMyWebinars  \* MERGEFORMAT ">
+              <w:r>
+                <w:rPr>
+                  <w:noProof/>
+                </w:rPr>
+                <w:t>«LinkToMyWebinars»</w:t>
+              </w:r>
+            </w:fldSimple>
           </w:p>
           <w:p>
             <w:pPr>
@@ -689,27 +713,14 @@
             <w:r>
               <w:t xml:space="preserve"> - you can access the content by visiting the link below. No password required but you will be prompted for name and email. </w:t>
             </w:r>
-            <w:r>
-              <w:fldChar w:fldCharType="begin"/>
-            </w:r>
-            <w:r>
-              <w:instrText xml:space="preserve"> MERGEFIELD  OndemandLink  \* MERGEFORMAT </w:instrText>
-            </w:r>
-            <w:r>
-              <w:fldChar w:fldCharType="separate"/>
-            </w:r>
-            <w:r>
-              <w:rPr>
-                <w:noProof/>
-              </w:rPr>
-              <w:t>«OndemandLink»</w:t>
-            </w:r>
-            <w:r>
-              <w:rPr>
-                <w:noProof/>
-              </w:rPr>
-              <w:fldChar w:fldCharType="end"/>
-            </w:r>
+            <w:fldSimple w:instr=" MERGEFIELD  OndemandLink  \* MERGEFORMAT ">
+              <w:r>
+                <w:rPr>
+                  <w:noProof/>
+                </w:rPr>
+                <w:t>«OndemandLink»</w:t>
+              </w:r>
+            </w:fldSimple>
             <w:r>
               <w:t>.</w:t>
             </w:r>
@@ -721,27 +732,14 @@
                 <w:noProof/>
               </w:rPr>
             </w:pPr>
-            <w:r>
-              <w:fldChar w:fldCharType="begin"/>
-            </w:r>
-            <w:r>
-              <w:instrText xml:space="preserve"> MERGEFIELD  PaymentCaption  \* MERGEFORMAT </w:instrText>
-            </w:r>
-            <w:r>
-              <w:fldChar w:fldCharType="separate"/>
-            </w:r>
-            <w:r>
-              <w:rPr>
-                <w:noProof/>
-              </w:rPr>
-              <w:t>«PaymentCaption»</w:t>
-            </w:r>
-            <w:r>
-              <w:rPr>
-                <w:noProof/>
-              </w:rPr>
-              <w:fldChar w:fldCharType="end"/>
-            </w:r>
+            <w:fldSimple w:instr=" MERGEFIELD  PaymentCaption  \* MERGEFORMAT ">
+              <w:r>
+                <w:rPr>
+                  <w:noProof/>
+                </w:rPr>
+                <w:t>«PaymentCaption»</w:t>
+              </w:r>
+            </w:fldSimple>
           </w:p>
           <w:p/>
           <w:p>
@@ -1073,7 +1071,7 @@
 </file>
 
 <file path=word/styles.xml><?xml version="1.0" encoding="utf-8"?>
-<w:styles xmlns:mc="http://schemas.openxmlformats.org/markup-compatibility/2006" xmlns:r="http://schemas.openxmlformats.org/officeDocument/2006/relationships" xmlns:w="http://schemas.openxmlformats.org/wordprocessingml/2006/main" xmlns:w14="http://schemas.microsoft.com/office/word/2010/wordml" xmlns:w15="http://schemas.microsoft.com/office/word/2012/wordml" xmlns:w16se="http://schemas.microsoft.com/office/word/2015/wordml/symex" mc:Ignorable="w14 w15 w16se">
+<w:styles xmlns:mc="http://schemas.openxmlformats.org/markup-compatibility/2006" xmlns:r="http://schemas.openxmlformats.org/officeDocument/2006/relationships" xmlns:w="http://schemas.openxmlformats.org/wordprocessingml/2006/main" xmlns:w14="http://schemas.microsoft.com/office/word/2010/wordml" xmlns:w15="http://schemas.microsoft.com/office/word/2012/wordml" xmlns:w16cid="http://schemas.microsoft.com/office/word/2016/wordml/cid" xmlns:w16se="http://schemas.microsoft.com/office/word/2015/wordml/symex" mc:Ignorable="w14 w15 w16se w16cid">
   <w:docDefaults>
     <w:rPrDefault>
       <w:rPr>
@@ -1089,7 +1087,7 @@
       </w:pPr>
     </w:pPrDefault>
   </w:docDefaults>
-  <w:latentStyles w:defLockedState="0" w:defUIPriority="99" w:defSemiHidden="0" w:defUnhideWhenUsed="0" w:defQFormat="0" w:count="374">
+  <w:latentStyles w:defLockedState="0" w:defUIPriority="99" w:defSemiHidden="0" w:defUnhideWhenUsed="0" w:defQFormat="0" w:count="375">
     <w:lsdException w:name="Normal" w:uiPriority="0" w:qFormat="1"/>
     <w:lsdException w:name="heading 1" w:uiPriority="9" w:qFormat="1"/>
     <w:lsdException w:name="heading 2" w:semiHidden="1" w:uiPriority="9" w:unhideWhenUsed="1" w:qFormat="1"/>
@@ -1195,7 +1193,6 @@
     <w:lsdException w:name="HTML Sample" w:semiHidden="1" w:unhideWhenUsed="1"/>
     <w:lsdException w:name="HTML Typewriter" w:semiHidden="1" w:unhideWhenUsed="1"/>
     <w:lsdException w:name="HTML Variable" w:semiHidden="1" w:unhideWhenUsed="1"/>
-    <w:lsdException w:name="Normal Table" w:semiHidden="1" w:unhideWhenUsed="1"/>
     <w:lsdException w:name="annotation subject" w:semiHidden="1" w:unhideWhenUsed="1"/>
     <w:lsdException w:name="No List" w:semiHidden="1" w:unhideWhenUsed="1"/>
     <w:lsdException w:name="Outline List 1" w:semiHidden="1" w:unhideWhenUsed="1"/>
@@ -1242,10 +1239,8 @@
     <w:lsdException w:name="Table Subtle 2" w:semiHidden="1" w:unhideWhenUsed="1"/>
     <w:lsdException w:name="Table Web 1" w:semiHidden="1" w:unhideWhenUsed="1"/>
     <w:lsdException w:name="Table Web 2" w:semiHidden="1" w:unhideWhenUsed="1"/>
-    <w:lsdException w:name="Table Web 3" w:semiHidden="1" w:unhideWhenUsed="1"/>
     <w:lsdException w:name="Balloon Text" w:semiHidden="1" w:unhideWhenUsed="1"/>
     <w:lsdException w:name="Table Grid" w:uiPriority="39"/>
-    <w:lsdException w:name="Table Theme" w:semiHidden="1" w:unhideWhenUsed="1"/>
     <w:lsdException w:name="Placeholder Text" w:semiHidden="1"/>
     <w:lsdException w:name="No Spacing" w:uiPriority="1" w:qFormat="1"/>
     <w:lsdException w:name="Light Shading" w:uiPriority="60"/>
@@ -1464,6 +1459,7 @@
     <w:lsdException w:name="Mention" w:semiHidden="1" w:unhideWhenUsed="1"/>
     <w:lsdException w:name="Smart Hyperlink" w:semiHidden="1" w:unhideWhenUsed="1"/>
     <w:lsdException w:name="Hashtag" w:semiHidden="1" w:unhideWhenUsed="1"/>
+    <w:lsdException w:name="Unresolved Mention" w:semiHidden="1" w:unhideWhenUsed="1"/>
   </w:latentStyles>
   <w:style w:type="paragraph" w:default="1" w:styleId="Normal">
     <w:name w:val="Normal"/>
@@ -1837,7 +1833,7 @@
 </file>
 
 <file path=customXml/itemProps1.xml><?xml version="1.0" encoding="utf-8"?>
-<ds:datastoreItem xmlns:ds="http://schemas.openxmlformats.org/officeDocument/2006/customXml" ds:itemID="{F43E2A0E-2A82-42ED-BC0F-409B9BC1C6F5}">
+<ds:datastoreItem xmlns:ds="http://schemas.openxmlformats.org/officeDocument/2006/customXml" ds:itemID="{3714CA23-E20F-489A-B539-DA04C00F7F8D}">
   <ds:schemaRefs>
     <ds:schemaRef ds:uri="http://schemas.openxmlformats.org/officeDocument/2006/bibliography"/>
   </ds:schemaRefs>

</xml_diff>